<commit_message>
docs(api): ampliar Swagger a toda la API (29 operaciones) y actualizar persistencia
- openapi.yaml v2: agrega favoritos, pagos, premium, resenas (+resumen IA), reservas/manage,
  mapas/locks, support/chat y auth/signup; actualiza mapas/search y reservas/reserve (modo PRO,
  PostGIS, acciones PATCH); anade servidor de produccion. 15 rutas / 29 operaciones.
- README API: tabla-resumen de endpoints.
- Descripcion de persistencia: seccion 'Evolucion del esquema' (favoritos/payments/spot_locks,
  columnas nuevas y SP de reserva profesional: crear_reserva_pro, confirmar/completar/cancelar_pro,
  reprogramar, calificar_reserva, obtener_resenas). Corrige tipo de estacionamientos.id.

Co-Authored-By: Claude Opus 4.8 <noreply@anthropic.com>
</commit_message>
<xml_diff>
--- a/ENTREGA_PARCIAL3/02_Descripcion_Persistencia.docx
+++ b/ENTREGA_PARCIAL3/02_Descripcion_Persistencia.docx
@@ -1311,7 +1311,7 @@
                 <w:szCs w:val="18"/>
                 <w:rFonts w:ascii="Consolas" w:cs="Consolas" w:eastAsia="Consolas" w:hAnsi="Consolas"/>
               </w:rPr>
-              <w:t xml:space="preserve">id (uuid, PK)</w:t>
+              <w:t xml:space="preserve">id (PK)</w:t>
             </w:r>
           </w:p>
         </w:tc>
@@ -1343,7 +1343,7 @@
                 <w:b w:val="false"/>
                 <w:bCs w:val="false"/>
               </w:rPr>
-              <w:t xml:space="preserve">Identificador del estacionamiento.</w:t>
+              <w:t xml:space="preserve">Identificador. En el esquema base es uuid; en producción se alineó a entero (serial).</w:t>
             </w:r>
           </w:p>
         </w:tc>
@@ -1619,7 +1619,7 @@
                 <w:b w:val="false"/>
                 <w:bCs w:val="false"/>
               </w:rPr>
-              <w:t xml:space="preserve">Coordenadas geográficas.</w:t>
+              <w:t xml:space="preserve">Coordenadas geográficas (con columna PostGIS para búsqueda espacial).</w:t>
             </w:r>
           </w:p>
         </w:tc>
@@ -2586,7 +2586,7 @@
         <w:spacing w:before="300" w:after="140" w:line="276" w:lineRule="auto"/>
       </w:pPr>
       <w:r>
-        <w:t xml:space="preserve">6. Conclusión</w:t>
+        <w:t xml:space="preserve">6. Evolución del esquema (funcionalidades avanzadas)</w:t>
       </w:r>
     </w:p>
     <w:p>
@@ -2595,7 +2595,292 @@
         <w:jc w:val="both"/>
       </w:pPr>
       <w:r>
-        <w:t xml:space="preserve">La estrategia de persistencia concentra la integridad y la seguridad en PostgreSQL: el modelo relacional con claves foráneas y restricciones CHECK garantiza la consistencia de los datos; las políticas RLS aseguran el acceso por usuario; y los procedimientos almacenados encapsulan las transacciones críticas (reserva y cancelación) de forma atómica y resistente a la concurrencia. Este enfoque cumple el requisito de la rúbrica de contar con un recurso de persistencia robusto mediante procedimientos almacenados.</w:t>
+        <w:t xml:space="preserve">Sobre el núcleo anterior, el sistema incorpora funcionalidades adicionales que ampliaron el esquema mediante migraciones idempotentes (sql/005 a sql/013). Se resumen a continuación.</w:t>
+      </w:r>
+    </w:p>
+    <w:p>
+      <w:pPr>
+        <w:pStyle w:val="Heading2"/>
+        <w:spacing w:before="200" w:after="100" w:line="276" w:lineRule="auto"/>
+      </w:pPr>
+      <w:r>
+        <w:t xml:space="preserve">6.1. Tablas nuevas</w:t>
+      </w:r>
+    </w:p>
+    <w:p>
+      <w:pPr>
+        <w:pStyle w:val="ListParagraph"/>
+        <w:numPr>
+          <w:ilvl w:val="0"/>
+          <w:numId w:val="1"/>
+        </w:numPr>
+        <w:spacing w:line="360" w:lineRule="auto" w:after="120"/>
+        <w:jc w:val="both"/>
+      </w:pPr>
+      <w:r>
+        <w:rPr>
+          <w:b/>
+          <w:bCs/>
+        </w:rPr>
+        <w:t xml:space="preserve">favoritos</w:t>
+      </w:r>
+      <w:r>
+        <w:t xml:space="preserve">: estacionamientos guardados por el usuario (id uuid, user_id, estacionamiento_id, UNIQUE(user_id, estacionamiento_id)); con RLS acotada por auth.uid().</w:t>
+      </w:r>
+    </w:p>
+    <w:p>
+      <w:pPr>
+        <w:pStyle w:val="ListParagraph"/>
+        <w:numPr>
+          <w:ilvl w:val="0"/>
+          <w:numId w:val="1"/>
+        </w:numPr>
+        <w:spacing w:line="360" w:lineRule="auto" w:after="120"/>
+        <w:jc w:val="both"/>
+      </w:pPr>
+      <w:r>
+        <w:rPr>
+          <w:b/>
+          <w:bCs/>
+        </w:rPr>
+        <w:t xml:space="preserve">payments</w:t>
+      </w:r>
+      <w:r>
+        <w:t xml:space="preserve">: registro de pagos de reservas (reserva_id, user_id, amount, status, provider, transaction_id), con verificación de propiedad, de monto e idempotencia.</w:t>
+      </w:r>
+    </w:p>
+    <w:p>
+      <w:pPr>
+        <w:pStyle w:val="ListParagraph"/>
+        <w:numPr>
+          <w:ilvl w:val="0"/>
+          <w:numId w:val="1"/>
+        </w:numPr>
+        <w:spacing w:line="360" w:lineRule="auto" w:after="120"/>
+        <w:jc w:val="both"/>
+      </w:pPr>
+      <w:r>
+        <w:rPr>
+          <w:b/>
+          <w:bCs/>
+        </w:rPr>
+        <w:t xml:space="preserve">spot_locks</w:t>
+      </w:r>
+      <w:r>
+        <w:t xml:space="preserve">: bloqueo temporal de una plaza (5 min) para evitar la doble selección concurrente, con restricción UNIQUE por (estacionamiento_id, spot_label).</w:t>
+      </w:r>
+    </w:p>
+    <w:p>
+      <w:pPr>
+        <w:pStyle w:val="Heading2"/>
+        <w:spacing w:before="200" w:after="100" w:line="276" w:lineRule="auto"/>
+      </w:pPr>
+      <w:r>
+        <w:t xml:space="preserve">6.2. Columnas añadidas</w:t>
+      </w:r>
+    </w:p>
+    <w:p>
+      <w:pPr>
+        <w:pStyle w:val="ListParagraph"/>
+        <w:numPr>
+          <w:ilvl w:val="0"/>
+          <w:numId w:val="1"/>
+        </w:numPr>
+        <w:spacing w:line="360" w:lineRule="auto" w:after="120"/>
+        <w:jc w:val="both"/>
+      </w:pPr>
+      <w:r>
+        <w:rPr>
+          <w:b/>
+          <w:bCs/>
+        </w:rPr>
+        <w:t xml:space="preserve">reservas</w:t>
+      </w:r>
+      <w:r>
+        <w:t xml:space="preserve">: fecha_inicio, fecha_fin, precio_total y updated_at (reserva profesional por ventana de tiempo); calificacion, comentario y calificada_at (reseñas); estados ampliados a pendiente, confirmada, activa, completada y cancelada.</w:t>
+      </w:r>
+    </w:p>
+    <w:p>
+      <w:pPr>
+        <w:pStyle w:val="ListParagraph"/>
+        <w:numPr>
+          <w:ilvl w:val="0"/>
+          <w:numId w:val="1"/>
+        </w:numPr>
+        <w:spacing w:line="360" w:lineRule="auto" w:after="120"/>
+        <w:jc w:val="both"/>
+      </w:pPr>
+      <w:r>
+        <w:rPr>
+          <w:b/>
+          <w:bCs/>
+        </w:rPr>
+        <w:t xml:space="preserve">estacionamientos</w:t>
+      </w:r>
+      <w:r>
+        <w:t xml:space="preserve">: comuna, rating y reviews_count (agregados de reseñas), activo (borrado lógico), photos[] (galería) y precios por minuto y por día.</w:t>
+      </w:r>
+    </w:p>
+    <w:p>
+      <w:pPr>
+        <w:pStyle w:val="ListParagraph"/>
+        <w:numPr>
+          <w:ilvl w:val="0"/>
+          <w:numId w:val="1"/>
+        </w:numPr>
+        <w:spacing w:line="360" w:lineRule="auto" w:after="120"/>
+        <w:jc w:val="both"/>
+      </w:pPr>
+      <w:r>
+        <w:rPr>
+          <w:b/>
+          <w:bCs/>
+        </w:rPr>
+        <w:t xml:space="preserve">perfiles</w:t>
+      </w:r>
+      <w:r>
+        <w:t xml:space="preserve">: plan, plan_ciclo y plan_desde (planes Premium), además de apellido y telefono.</w:t>
+      </w:r>
+    </w:p>
+    <w:p>
+      <w:pPr>
+        <w:pStyle w:val="Heading2"/>
+        <w:spacing w:before="200" w:after="100" w:line="276" w:lineRule="auto"/>
+      </w:pPr>
+      <w:r>
+        <w:t xml:space="preserve">6.3. Procedimientos almacenados de reserva profesional</w:t>
+      </w:r>
+    </w:p>
+    <w:p>
+      <w:pPr>
+        <w:spacing w:line="360" w:lineRule="auto" w:after="120"/>
+        <w:jc w:val="both"/>
+      </w:pPr>
+      <w:r>
+        <w:t xml:space="preserve">La gestión avanzada de reservas se implementa con funciones PL/pgSQL (SECURITY DEFINER), todas con bloqueo de fila para serializar el control de capacidad:</w:t>
+      </w:r>
+    </w:p>
+    <w:p>
+      <w:pPr>
+        <w:pStyle w:val="ListParagraph"/>
+        <w:numPr>
+          <w:ilvl w:val="0"/>
+          <w:numId w:val="1"/>
+        </w:numPr>
+        <w:spacing w:line="360" w:lineRule="auto" w:after="120"/>
+        <w:jc w:val="both"/>
+      </w:pPr>
+      <w:r>
+        <w:rPr>
+          <w:b/>
+          <w:bCs/>
+        </w:rPr>
+        <w:t xml:space="preserve">crear_reserva_pro</w:t>
+      </w:r>
+      <w:r>
+        <w:t xml:space="preserve">: crea una reserva para una ventana [inicio, fin) validando capacidad por solapamiento y calculando el precio_total por horas.</w:t>
+      </w:r>
+    </w:p>
+    <w:p>
+      <w:pPr>
+        <w:pStyle w:val="ListParagraph"/>
+        <w:numPr>
+          <w:ilvl w:val="0"/>
+          <w:numId w:val="1"/>
+        </w:numPr>
+        <w:spacing w:line="360" w:lineRule="auto" w:after="120"/>
+        <w:jc w:val="both"/>
+      </w:pPr>
+      <w:r>
+        <w:rPr>
+          <w:b/>
+          <w:bCs/>
+        </w:rPr>
+        <w:t xml:space="preserve">confirmar_reserva / completar_reserva / cancelar_reserva_pro</w:t>
+      </w:r>
+      <w:r>
+        <w:t xml:space="preserve">: transicionan el estado validando el rol (arrendador o conductor según corresponda).</w:t>
+      </w:r>
+    </w:p>
+    <w:p>
+      <w:pPr>
+        <w:pStyle w:val="ListParagraph"/>
+        <w:numPr>
+          <w:ilvl w:val="0"/>
+          <w:numId w:val="1"/>
+        </w:numPr>
+        <w:spacing w:line="360" w:lineRule="auto" w:after="120"/>
+        <w:jc w:val="both"/>
+      </w:pPr>
+      <w:r>
+        <w:rPr>
+          <w:b/>
+          <w:bCs/>
+        </w:rPr>
+        <w:t xml:space="preserve">reprogramar_reserva</w:t>
+      </w:r>
+      <w:r>
+        <w:t xml:space="preserve">: cambia el rango re-validando la capacidad y recalculando el precio.</w:t>
+      </w:r>
+    </w:p>
+    <w:p>
+      <w:pPr>
+        <w:pStyle w:val="ListParagraph"/>
+        <w:numPr>
+          <w:ilvl w:val="0"/>
+          <w:numId w:val="1"/>
+        </w:numPr>
+        <w:spacing w:line="360" w:lineRule="auto" w:after="120"/>
+        <w:jc w:val="both"/>
+      </w:pPr>
+      <w:r>
+        <w:rPr>
+          <w:b/>
+          <w:bCs/>
+        </w:rPr>
+        <w:t xml:space="preserve">calificar_reserva</w:t>
+      </w:r>
+      <w:r>
+        <w:t xml:space="preserve">: registra la calificación (1–5) de una reserva completada y recalcula el rating del estacionamiento.</w:t>
+      </w:r>
+    </w:p>
+    <w:p>
+      <w:pPr>
+        <w:pStyle w:val="ListParagraph"/>
+        <w:numPr>
+          <w:ilvl w:val="0"/>
+          <w:numId w:val="1"/>
+        </w:numPr>
+        <w:spacing w:line="360" w:lineRule="auto" w:after="120"/>
+        <w:jc w:val="both"/>
+      </w:pPr>
+      <w:r>
+        <w:rPr>
+          <w:b/>
+          <w:bCs/>
+        </w:rPr>
+        <w:t xml:space="preserve">obtener_resenas</w:t>
+      </w:r>
+      <w:r>
+        <w:t xml:space="preserve">: expone las reseñas de un estacionamiento al cliente anónimo, sin requerir clave de servicio.</w:t>
+      </w:r>
+    </w:p>
+    <w:p>
+      <w:pPr>
+        <w:pStyle w:val="Heading1"/>
+        <w:spacing w:before="300" w:after="140" w:line="276" w:lineRule="auto"/>
+      </w:pPr>
+      <w:r>
+        <w:t xml:space="preserve">7. Conclusión</w:t>
+      </w:r>
+    </w:p>
+    <w:p>
+      <w:pPr>
+        <w:spacing w:line="360" w:lineRule="auto" w:after="120"/>
+        <w:jc w:val="both"/>
+      </w:pPr>
+      <w:r>
+        <w:t xml:space="preserve">La estrategia de persistencia concentra la integridad y la seguridad en PostgreSQL: el modelo relacional con claves foráneas y restricciones CHECK garantiza la consistencia de los datos; las políticas RLS aseguran el acceso por usuario; y los procedimientos almacenados encapsulan las transacciones críticas (reserva, reserva profesional, cancelación, calificación) de forma atómica y resistente a la concurrencia. Este enfoque cumple el requisito de la rúbrica de contar con un recurso de persistencia robusto mediante procedimientos almacenados.</w:t>
       </w:r>
     </w:p>
     <w:sectPr>

</xml_diff>